<commit_message>
Add multi-sheet marker support and one-click toolbar
- Метки вида {Лист!A5} читают ячейку с указанного листа книги;
  {A5} по-прежнему берёт лист по умолчанию из настроек
- Кириллица проверяется только в адресе (русские имена листов допустимы)
- Автосоздание панели SmartCells на вкладке «Надстройки» с кнопками
  Обновить/Настройки/Убрать связь — ручная настройка QAT больше не нужна
- Тестовые файлы: добавлен второй лист и метка {Лист2!A1}
- Обновлены INSTALL.md и TEST_PLAN.md

Co-Authored-By: Claude Opus 4.8 <noreply@anthropic.com>
Claude-Session: https://claude.ai/code/session_01XoXxRKY7BcWh69G1JzSWJ6
</commit_message>
<xml_diff>
--- a/test/Тест_документ.docx
+++ b/test/Тест_документ.docx
@@ -48,6 +48,11 @@
     <w:p>
       <w:r>
         <w:t>Пустая ячейка: {A7}</w:t>
+      </w:r>
+    </w:p>
+    <w:p>
+      <w:r>
+        <w:t>Значение с другого листа: {Лист2!A1}</w:t>
       </w:r>
     </w:p>
     <w:p/>

</xml_diff>